<commit_message>
Draft_024: refer to coding spreadsheet, not Draft_004 filename
</commit_message>
<xml_diff>
--- a/thesis/003_ThesisProposal_Draft_024.docx
+++ b/thesis/003_ThesisProposal_Draft_024.docx
@@ -2645,7 +2645,7 @@
           <w:szCs w:val="22"/>
           <w:rtl w:val="0"/>
         </w:rPr>
-        <w:t>Hedge identification, type classification, and functional coding were all conducted manually using a Google Sheets coding template. Each abstract was read in full before coding began to ensure hedges were interpreted in context rather than flagged as isolated tokens. Ambiguous cases were resolved using the predefined decision tree in Appendix A. Frequency counts were normalized per 100 words to enable comparison across abstracts of varying length. In a separate pass, each abstract was also coded for outcome type from its results language (Binary, Continuous, Mixed, Null/NS, Other), so that density patterns could be read against the kind of finding reported; those codes are tabulated in Compiled Results Draft_004 and discussed in Part IV. While the quantitative analysis identified what hedges were used, the qualitative interpretation applied Salager-Meyer’s (1994) claim-responsibility framework and Hyland’s (2005) stance model to explain why these patterns occurred. Given the corpus size, findings were interpreted as indicative patterns within the PSAU context, supplemented by exploratory inferential analyses (chi-square, Kruskal-Wallis) whose results are reported transparently but should not be treated as confirmatory given the small, zero-inflated sample.</w:t>
+        <w:t>Hedge identification, type classification, and functional coding were all conducted manually using a Google Sheets coding template. Each abstract was read in full before coding began to ensure hedges were interpreted in context rather than flagged as isolated tokens. Ambiguous cases were resolved using the predefined decision tree in Appendix A. Frequency counts were normalized per 100 words to enable comparison across abstracts of varying length. In a separate pass, each abstract was also coded for outcome type from its results language (Binary, Continuous, Mixed, Null/NS, Other), so that density patterns could be read against the kind of finding reported; those codes are recorded in the coding spreadsheet and discussed in Part IV. While the quantitative analysis identified what hedges were used, the qualitative interpretation applied Salager-Meyer’s (1994) claim-responsibility framework and Hyland’s (2005) stance model to explain why these patterns occurred. Given the corpus size, findings were interpreted as indicative patterns within the PSAU context, supplemented by exploratory inferential analyses (chi-square, Kruskal-Wallis) whose results are reported transparently but should not be treated as confirmatory given the small, zero-inflated sample.</w:t>
       </w:r>
       <w:r>
         <w:rPr>
@@ -7733,7 +7733,7 @@
           <w:szCs w:val="22"/>
           <w:rtl w:val="0"/>
         </w:rPr>
-        <w:t xml:space="preserve">Veterinary Medicine's low density is more difficult to interpret. Many VM abstracts in this corpus reported clinical findings from animal studies (e.g., drug efficacy trials, disease detection, hematological profiling). Outcome-type coding across the full corpus (Part IV; Compiled Results Draft_004) does not support explaining that low density by binary outcomes alone: Biology abstracts with binary results still hedge more than VM binary abstracts. The low rate is better treated as a VM pattern in this institutional corpus—consistent with departmental or supervisory practice, outcome mix, or both—rather than as a general consequence of binary evidence under Salager-Meyer's (1994) claim-responsibility framework.</w:t>
+        <w:t xml:space="preserve">Veterinary Medicine's low density is more difficult to interpret. Many VM abstracts in this corpus reported clinical findings from animal studies (e.g., drug efficacy trials, disease detection, hematological profiling). Outcome-type coding across the full corpus (Part IV; the coding spreadsheet) does not support explaining that low density by binary outcomes alone: Biology abstracts with binary results still hedge more than VM binary abstracts. The low rate is better treated as a VM pattern in this institutional corpus—consistent with departmental or supervisory practice, outcome mix, or both—rather than as a general consequence of binary evidence under Salager-Meyer's (1994) claim-responsibility framework.</w:t>
       </w:r>
       <w:r>
         <w:rPr>
@@ -8519,7 +8519,7 @@
         <w:rPr>
           <w:rtl w:val="0"/>
         </w:rPr>
-        <w:t xml:space="preserve">Outcome type was coded for all 60 abstracts under five categories (Binary, Continuous, Mixed, Null/NS, Other; see Compiled Results Draft_004). Coding used the abstract's own results language: presence/absence or diagnostic positive/negative counts as Binary; explicit non-significance as Null/NS; means, yields, and rates as Continuous; combinations as Mixed. On that coding, the binary-outcome account of VM density is not supported. VM Binary abstracts average 0.38 hedges (n=8); Biology Binary abstracts average 1.57 (n=7). Same outcome class, substantially more hedging in Biology. The low VM rate is therefore better read as a pattern within this VM subset than as an effect of binary evidence as such. A separate pattern in the same table is worth noting: Agriculture accounts for 14 of 20 Null/NS abstracts, against 2 of 20 in VM, and those Agriculture Null/NS texts average about 1.5 hedges. Acs2 illustrates how a non-significant finding can still attract hedges that keep possible benefits in view; one abstract cannot establish a rule. With small cells, both the VM reading and the Null/NS share remain suggestive.</w:t>
+        <w:t xml:space="preserve">Outcome type was coded for all 60 abstracts under five categories (Binary, Continuous, Mixed, Null/NS, Other; see the coding spreadsheet). Coding used the abstract's own results language: presence/absence or diagnostic positive/negative counts as Binary; explicit non-significance as Null/NS; means, yields, and rates as Continuous; combinations as Mixed. On that coding, the binary-outcome account of VM density is not supported. VM Binary abstracts average 0.38 hedges (n=8); Biology Binary abstracts average 1.57 (n=7). Same outcome class, substantially more hedging in Biology. The low VM rate is therefore better read as a pattern within this VM subset than as an effect of binary evidence as such. A separate pattern in the same table is worth noting: Agriculture accounts for 14 of 20 Null/NS abstracts, against 2 of 20 in VM, and those Agriculture Null/NS texts average about 1.5 hedges. Acs2 illustrates how a non-significant finding can still attract hedges that keep possible benefits in view; one abstract cannot establish a rule. With small cells, both the VM reading and the Null/NS share remain suggestive.</w:t>
       </w:r>
     </w:p>
     <w:p>

</xml_diff>